<commit_message>
docs: finalize presentation-ready project materials
</commit_message>
<xml_diff>
--- a/docs/reports/Report_4_AutoWash_Priority_Booking_Engine.docx
+++ b/docs/reports/Report_4_AutoWash_Priority_Booking_Engine.docx
@@ -1009,26 +1009,8 @@
             </w:tcBorders>
           </w:tcPr>
           <w:p>
-            <w:pPr>
-              <w:spacing w:line="360" w:lineRule="auto"/>
-            </w:pPr>
-            <w:r>
-              <w:rPr>
-                <w:rFonts w:eastAsia="Georgia" w:hAnsi="Georgia" w:cs="Georgia"/>
-                <w:i/>
-                <w:color w:val="000000"/>
-                <w:sz w:val="17"/>
-              </w:rPr>
-              <w:t>68</w:t>
-            </w:r>
-            <w:r>
-              <w:rPr>
-                <w:rFonts w:eastAsia="Georgia" w:hAnsi="Georgia" w:cs="Georgia"/>
-                <w:i/>
-                <w:color w:val="000000"/>
-                <w:sz w:val="17"/>
-              </w:rPr>
-              <w:t xml:space="preserve">3 </w:t>
+            <w:r>
+              <w:t>804</w:t>
             </w:r>
           </w:p>
         </w:tc>
@@ -1096,17 +1078,8 @@
             </w:tcBorders>
           </w:tcPr>
           <w:p>
-            <w:pPr>
-              <w:spacing w:line="360" w:lineRule="auto"/>
-            </w:pPr>
-            <w:r>
-              <w:rPr>
-                <w:rFonts w:eastAsia="Georgia" w:hAnsi="Georgia" w:cs="Georgia"/>
-                <w:i/>
-                <w:color w:val="000000"/>
-                <w:sz w:val="17"/>
-              </w:rPr>
-              <w:t>765</w:t>
+            <w:r>
+              <w:t>721</w:t>
             </w:r>
           </w:p>
         </w:tc>
@@ -1174,17 +1147,8 @@
             </w:tcBorders>
           </w:tcPr>
           <w:p>
-            <w:pPr>
-              <w:spacing w:line="360" w:lineRule="auto"/>
-            </w:pPr>
-            <w:r>
-              <w:rPr>
-                <w:rFonts w:eastAsia="Georgia" w:hAnsi="Georgia" w:cs="Georgia"/>
-                <w:i/>
-                <w:color w:val="000000"/>
-                <w:sz w:val="17"/>
-              </w:rPr>
-              <w:t>315</w:t>
+            <w:r>
+              <w:t>270</w:t>
             </w:r>
           </w:p>
         </w:tc>
@@ -1264,23 +1228,8 @@
             </w:tcBorders>
           </w:tcPr>
           <w:p>
-            <w:pPr>
-              <w:spacing w:line="360" w:lineRule="auto"/>
-              <w:rPr>
-                <w:rFonts w:eastAsia="Georgia" w:hAnsi="Georgia" w:cs="Georgia"/>
-                <w:i/>
-                <w:color w:val="000000"/>
-                <w:sz w:val="17"/>
-              </w:rPr>
-            </w:pPr>
-            <w:r>
-              <w:rPr>
-                <w:rFonts w:eastAsia="Georgia" w:hAnsi="Georgia" w:cs="Georgia"/>
-                <w:i/>
-                <w:color w:val="000000"/>
-                <w:sz w:val="17"/>
-              </w:rPr>
-              <w:t>155</w:t>
+            <w:r>
+              <w:t>131</w:t>
             </w:r>
           </w:p>
         </w:tc>
@@ -1360,23 +1309,8 @@
             </w:tcBorders>
           </w:tcPr>
           <w:p>
-            <w:pPr>
-              <w:spacing w:line="360" w:lineRule="auto"/>
-              <w:rPr>
-                <w:rFonts w:eastAsia="Georgia" w:hAnsi="Georgia" w:cs="Georgia"/>
-                <w:i/>
-                <w:color w:val="000000"/>
-                <w:sz w:val="17"/>
-              </w:rPr>
-            </w:pPr>
-            <w:r>
-              <w:rPr>
-                <w:rFonts w:eastAsia="Georgia" w:hAnsi="Georgia" w:cs="Georgia"/>
-                <w:i/>
-                <w:color w:val="000000"/>
-                <w:sz w:val="17"/>
-              </w:rPr>
-              <w:t>327</w:t>
+            <w:r>
+              <w:t>288</w:t>
             </w:r>
           </w:p>
         </w:tc>
@@ -1456,23 +1390,8 @@
             </w:tcBorders>
           </w:tcPr>
           <w:p>
-            <w:pPr>
-              <w:spacing w:line="360" w:lineRule="auto"/>
-              <w:rPr>
-                <w:rFonts w:eastAsia="Georgia" w:hAnsi="Georgia" w:cs="Georgia"/>
-                <w:i/>
-                <w:color w:val="000000"/>
-                <w:sz w:val="17"/>
-              </w:rPr>
-            </w:pPr>
-            <w:r>
-              <w:rPr>
-                <w:rFonts w:eastAsia="Georgia" w:hAnsi="Georgia" w:cs="Georgia"/>
-                <w:i/>
-                <w:color w:val="000000"/>
-                <w:sz w:val="17"/>
-              </w:rPr>
-              <w:t>197</w:t>
+            <w:r>
+              <w:t>179</w:t>
             </w:r>
           </w:p>
         </w:tc>
@@ -1553,23 +1472,8 @@
             </w:tcBorders>
           </w:tcPr>
           <w:p>
-            <w:pPr>
-              <w:spacing w:line="360" w:lineRule="auto"/>
-              <w:rPr>
-                <w:rFonts w:eastAsia="Georgia" w:hAnsi="Georgia" w:cs="Georgia"/>
-                <w:i/>
-                <w:color w:val="000000"/>
-                <w:sz w:val="17"/>
-              </w:rPr>
-            </w:pPr>
-            <w:r>
-              <w:rPr>
-                <w:rFonts w:eastAsia="Georgia" w:hAnsi="Georgia" w:cs="Georgia"/>
-                <w:i/>
-                <w:color w:val="000000"/>
-                <w:sz w:val="17"/>
-              </w:rPr>
-              <w:t>162</w:t>
+            <w:r>
+              <w:t>144</w:t>
             </w:r>
           </w:p>
         </w:tc>
@@ -1649,23 +1553,8 @@
             </w:tcBorders>
           </w:tcPr>
           <w:p>
-            <w:pPr>
-              <w:spacing w:line="360" w:lineRule="auto"/>
-              <w:rPr>
-                <w:rFonts w:eastAsia="Georgia" w:hAnsi="Georgia" w:cs="Georgia"/>
-                <w:i/>
-                <w:color w:val="000000"/>
-                <w:sz w:val="17"/>
-              </w:rPr>
-            </w:pPr>
-            <w:r>
-              <w:rPr>
-                <w:rFonts w:eastAsia="Georgia" w:hAnsi="Georgia" w:cs="Georgia"/>
-                <w:i/>
-                <w:color w:val="000000"/>
-                <w:sz w:val="17"/>
-              </w:rPr>
-              <w:t>77</w:t>
+            <w:r>
+              <w:t>67</w:t>
             </w:r>
           </w:p>
         </w:tc>
@@ -2804,22 +2693,8 @@
             </w:tcBorders>
           </w:tcPr>
           <w:p>
-            <w:pPr>
-              <w:rPr>
-                <w:rFonts w:hAnsi="Georgia"/>
-                <w:iCs/>
-                <w:sz w:val="17"/>
-                <w:szCs w:val="17"/>
-              </w:rPr>
-            </w:pPr>
-            <w:r>
-              <w:rPr>
-                <w:rFonts w:hAnsi="Georgia"/>
-                <w:iCs/>
-                <w:sz w:val="17"/>
-                <w:szCs w:val="17"/>
-              </w:rPr>
-              <w:t>Allocates future bookings into queue, waitlist or overflow</w:t>
+            <w:r>
+              <w:t>Accepts future bookings only within capacity and service-time limits; allocates them to Main Queue or Waitlist when the period is activated</w:t>
             </w:r>
           </w:p>
         </w:tc>
@@ -3108,22 +2983,8 @@
             </w:tcBorders>
           </w:tcPr>
           <w:p>
-            <w:pPr>
-              <w:rPr>
-                <w:rFonts w:hAnsi="Georgia"/>
-                <w:iCs/>
-                <w:sz w:val="17"/>
-                <w:szCs w:val="17"/>
-              </w:rPr>
-            </w:pPr>
-            <w:r>
-              <w:rPr>
-                <w:rFonts w:hAnsi="Georgia"/>
-                <w:iCs/>
-                <w:sz w:val="17"/>
-                <w:szCs w:val="17"/>
-              </w:rPr>
-              <w:t>Cancelling a booking may promote the highest-priority waitlist entry</w:t>
+            <w:r>
+              <w:t>Cancelling a booking scans the priority Waitlist and promotes the first booking that fits the remaining service time</w:t>
             </w:r>
           </w:p>
         </w:tc>

</xml_diff>